<commit_message>
fix a citation mismatch
</commit_message>
<xml_diff>
--- a/output/documents/manuscript_BMC_Public_Health.docx
+++ b/output/documents/manuscript_BMC_Public_Health.docx
@@ -149,7 +149,7 @@
     </w:p>
     <w:p>
       <w:r>
-        <w:t>We audited dimensional uniqueness, completeness across 34 years, missingness, nonnegativity, uncertainty-bound ordering, and age-bin consistency. The preserved IHME exports contained 2,720 exact zero point estimates: incidence Number and Rate at ages 0-9 and 80+, and prevalence and DALY Number and Rate at ages 0-9, in both countries, both sexes, and all years. These values were retained unchanged. The exports do not establish whether they are biological structural zeros or a GBD model-support convention. Log-rate APC analyses therefore used positive ages 10-69; the all-age decomposition retained the complete partition and an incidence sensitivity used ages 10-79. Decomposition used official GBD 2023 population estimates. The matching fine-age burden and population exports were accompanied by verified retrieval records, export identifiers, query dimensions, preserved raw-file records, and SHA-256 hashes. We checked age-specific reconstruction by multiplying population by rate and dividing by 100,000.</w:t>
+        <w:t>We checked dimensional uniqueness, completeness across 34 years, missingness, nonnegativity, uncertainty-bound ordering, and age-bin consistency. The retained IHME exports contained 2,720 exact zero point estimates: incidence Number and Rate at ages 0-9 and 80+, and prevalence and DALY Number and Rate at ages 0-9, in both countries, both sexes, and all years. These values were retained unchanged. The exports do not establish whether they are biological structural zeros or a GBD model-support convention. Log-rate APC analyses therefore used positive ages 10-69; the all-age decomposition retained the complete partition and an incidence sensitivity used ages 10-79. Decomposition used official GBD 2023 population estimates, with age-specific quantities reconstructed as population multiplied by rate and divided by 100,000.</w:t>
       </w:r>
     </w:p>
     <w:p>
@@ -162,7 +162,7 @@
     </w:p>
     <w:p>
       <w:r>
-        <w:t>We modeled log ASRs with an open Python implementation of piecewise linear regression, using the general joinpoint parameterization [9]. Candidate models allowed zero to two change points and required at least four annual observations per segment. The number and locations of change points were selected by the Bayesian information criterion. Segment annual percentage changes and overall average annual percentage changes (AAPCs) summarize fitted changes in annual GBD posterior means; change points are descriptive, not inferential. Continuous estimates are primary. For compact wording, absolute annual changes below 0.05% were labeled practically stable, with 0.02% and 0.10% thresholds as sensitivity checks; these are not statistical equivalence tests. Sensitivities varied breakpoint count, minimum segment length, calendar window, scale, and log-UI-width weights. We also fitted the same candidates by iterative Prais-Winsten feasible generalized least squares with an AR(1) error structure. All sensitivity results remained model-conditional descriptions rather than GBD posterior uncertainty. A registered NCI Joinpoint analysis may be used as optional software comparison but is not required for the primary open workflow [10].</w:t>
+        <w:t>We modeled log ASRs with an open Python implementation of piecewise linear regression, using the general joinpoint parameterization [9]. Candidate models allowed zero to two change points and required at least four annual observations per segment. The number and locations of change points were selected by the Bayesian information criterion. Segment annual percentage changes and overall average annual percentage changes (AAPCs) summarize fitted changes in annual GBD posterior means; change points are descriptive, not inferential. Continuous estimates are primary. For compact wording, absolute annual changes below 0.05% were labeled practically stable, with 0.02% and 0.10% thresholds as sensitivity checks; these are not statistical equivalence tests. Sensitivities varied breakpoint count, minimum segment length, calendar window, scale, and log-UI-width weights. We also fitted the same candidates by iterative Prais-Winsten feasible generalized least squares with an AR(1) error structure. All sensitivity results remained model-conditional descriptions rather than GBD posterior uncertainty. NCI Joinpoint is cited as methodological context [10]; no NCI software output was used in this analysis.</w:t>
       </w:r>
     </w:p>
     <w:p>
@@ -193,7 +193,7 @@
     </w:p>
     <w:p>
       <w:r>
-        <w:t>Custom descriptive APC summaries used equal five-year age groups covering 10-14 to 65-69 years and six equal periods from 1994-1998 through 2019-2023. Incidence was the principal secondary outcome; prevalence and DALY rate surfaces were exploratory extensions, not incident-event risks. We report a global period slope, separately fitted age-specific log-rate slopes, a descriptive age rate-ratio curve, and period- and cohort-curvature rate ratios. The population-weighted least-squares design included an intercept, centered linear age and period terms, and nonlinear age, period, and cohort bases orthogonal to intercept and linear trend. We do not claim equivalence to conventional NCI APC estimable functions, and all outputs are labeled custom descriptive summaries. An equal-weight sensitivity assessed the influence of population weights. Reference rate ratios were one, and period/cohort patterns were not interpreted causally. A window sensitivity used six periods from 1990-1994 through 2015-2019.</w:t>
+        <w:t>Custom descriptive APC summaries used equal five-year age groups covering 10-14 to 65-69 years and six equal periods from 1994-1998 through 2019-2023. Incidence was the principal secondary outcome; prevalence and DALY rate surfaces were exploratory extensions, not incident-event risks. The age-period-cohort identity and its estimable-function limitations were handled with constrained nonlinear functions [12-15]. We report a global period slope, separately fitted age-specific log-rate slopes, a descriptive age rate-ratio curve, and period- and cohort-curvature rate ratios. The population-weighted least-squares design included an intercept, centered linear age and period terms, and nonlinear age, period, and cohort bases orthogonal to intercept and linear trend. We do not claim equivalence to conventional NCI APC estimable functions, and all outputs are labeled custom descriptive summaries. An equal-weight sensitivity assessed the influence of population weights. Reference rate ratios were one, and period/cohort patterns were not interpreted causally. A window sensitivity used six periods from 1990-1994 through 2015-2019.</w:t>
       </w:r>
     </w:p>
     <w:p>
@@ -206,7 +206,7 @@
     </w:p>
     <w:p>
       <w:r>
-        <w:t>The analysis was conducted in Python with deterministic settings. Every table and figure is generated from saved machine-readable inputs. Reporting follows the Guidelines for Accurate and Transparent Health Estimates Reporting (GATHER) [16]. The working package contains the complete code, provenance table, data dictionary, and readiness metadata; these materials accompany this blinded submission package; no external archive DOI was designated for this build. OpenAI Codex, a large language model tool, was used during software engineering and manuscript drafting. All generated code, analyses, claims, and references were reviewed and remain the authors' responsibility; the tool is not an author.</w:t>
+        <w:t>The analysis was conducted in Python with deterministic settings. Every table and figure is generated from the retained machine-readable inputs. Reporting follows the Guidelines for Accurate and Transparent Health Estimates Reporting (GATHER) [16]. The working package contains the analysis scripts, canonical input data, machine-readable result tables, and figures. OpenAI Codex, a large language model tool, was used during software engineering and manuscript drafting. All generated code, analyses, claims, and references were reviewed and remain the authors' responsibility; the tool is not an author.</w:t>
       </w:r>
     </w:p>
     <w:p>
@@ -6988,7 +6988,7 @@
         <w:pStyle w:val="ListBullet"/>
       </w:pPr>
       <w:r>
-        <w:t>Supplementary file 1: supplementary_material.docx, containing Tables S1-S19 and Figures S1-S2.</w:t>
+        <w:t>Supplementary file 1: supplementary_material.docx, containing Tables S1-S15 and Figures S1-S2.</w:t>
       </w:r>
     </w:p>
     <w:p>
@@ -7004,15 +7004,7 @@
         <w:pStyle w:val="ListBullet"/>
       </w:pPr>
       <w:r>
-        <w:t>Supplementary file 3: publication_tables.xlsx and companion CSV files, containing all machine-readable analysis results and data definitions.</w:t>
-      </w:r>
-    </w:p>
-    <w:p>
-      <w:pPr>
-        <w:pStyle w:val="ListBullet"/>
-      </w:pPr>
-      <w:r>
-        <w:t>Reporting checklist: GATHER_checklist.docx, using the official 18-item WHO wording and order.</w:t>
+        <w:t>Supplementary file 3: companion CSV files containing the machine-readable analysis results.</w:t>
       </w:r>
     </w:p>
     <w:p>
@@ -7072,7 +7064,7 @@
     </w:p>
     <w:p>
       <w:r>
-        <w:t>GBD estimates are available through the IHME GBD Results Tool subject to IHME terms [8]. The analytic code, derived tables, provenance metadata, exact model settings, and validation records accompany this blinded submission package. No persistent public repository or archive DOI was designated for this build, and the package does not redistribute source data beyond applicable IHME terms.</w:t>
+        <w:t>GBD estimates are available through the IHME GBD Results Tool subject to IHME terms [8]. This working repository contains the analysis scripts, canonical CSV inputs, derived CSV tables, and figures. Any public redistribution of source data must comply with IHME terms. No persistent public repository or archive DOI has been assigned.</w:t>
       </w:r>
     </w:p>
     <w:p>
@@ -7240,7 +7232,7 @@
         <w:rPr>
           <w:sz w:val="18"/>
         </w:rPr>
-        <w:t>9. Kim HJ, Fay MP, Feuer EJ, Midthune DN. Permutation tests for joinpoint regression with applications to cancer rates. Stat Med. 2000;19(3):335-351; correction 2001;20(4):655.</w:t>
+        <w:t>9. Kim HJ, Fay MP, Feuer EJ, Midthune DN. Permutation tests for joinpoint regression with applications to cancer rates. Stat Med. 2000;19(3):335-351; correction 2001;20(4):655. doi:10.1002/(SICI)1097-0258(20000215)19:3&lt;335::AID-SIM336&gt;3.0.CO;2-Z.</w:t>
       </w:r>
     </w:p>
     <w:p>
@@ -7264,7 +7256,7 @@
         <w:rPr>
           <w:sz w:val="18"/>
         </w:rPr>
-        <w:t>11. Das Gupta P. Standardization and decomposition of rates: a user's manual. Current Population Reports, Series P23-186. Washington, DC: US Bureau of the Census; 1993.</w:t>
+        <w:t>11. Das Gupta P. Standardization and decomposition of rates: a user's manual. Current Population Reports, Series P23-186. Washington, DC: US Bureau of the Census; 1993. https://www.census.gov/library/publications/1993/demo/p23-186.html. Accessed 4 September 2026.</w:t>
       </w:r>
     </w:p>
     <w:p>
@@ -7276,7 +7268,7 @@
         <w:rPr>
           <w:sz w:val="18"/>
         </w:rPr>
-        <w:t>12. Holford TR. The estimation of age, period and cohort effects for vital rates. Biometrics. 1983;39(2):311-324.</w:t>
+        <w:t>12. Holford TR. The estimation of age, period and cohort effects for vital rates. Biometrics. 1983;39(2):311-324. doi:10.2307/2531004.</w:t>
       </w:r>
     </w:p>
     <w:p>
@@ -7288,7 +7280,7 @@
         <w:rPr>
           <w:sz w:val="18"/>
         </w:rPr>
-        <w:t>13. Clayton D, Schifflers E. Models for temporal variation in cancer rates. II: age-period-cohort models. Stat Med. 1987;6(4):469-481.</w:t>
+        <w:t>13. Clayton D, Schifflers E. Models for temporal variation in cancer rates. II: age-period-cohort models. Stat Med. 1987;6(4):469-481. doi:10.1002/sim.4780060406.</w:t>
       </w:r>
     </w:p>
     <w:p>
@@ -7300,7 +7292,7 @@
         <w:rPr>
           <w:sz w:val="18"/>
         </w:rPr>
-        <w:t>14. Luo L. Assessing validity and application scope of the intrinsic estimator approach to the age-period-cohort problem. Demography. 2013;50(6):1945-1967.</w:t>
+        <w:t>14. Luo L. Assessing validity and application scope of the intrinsic estimator approach to the age-period-cohort problem. Demography. 2013;50(6):1945-1967. doi:10.1007/s13524-013-0243-z.</w:t>
       </w:r>
     </w:p>
     <w:p>
@@ -7312,7 +7304,7 @@
         <w:rPr>
           <w:sz w:val="18"/>
         </w:rPr>
-        <w:t>15. Rutherford MJ, Lambert PC, Thompson JR. Age-period-cohort modeling. Stata J. 2010;10(4):606-627.</w:t>
+        <w:t>15. Rutherford MJ, Lambert PC, Thompson JR. Age-period-cohort modeling. Stata J. 2010;10(4):606-627. doi:10.1177/1536867X1101000405.</w:t>
       </w:r>
     </w:p>
     <w:p>

</xml_diff>